<commit_message>
Odisea sexta parte (Esqueria): comentario del símil de la esposa troyana; pdf y docx actualizados
Co-Authored-By: Claude Fable 5 <noreply@anthropic.com>
</commit_message>
<xml_diff>
--- a/odisea6_esqueria.docx
+++ b/odisea6_esqueria.docx
@@ -1218,6 +1218,14 @@
     <w:p>
       <w:pPr>
         <w:pStyle w:val="FirstParagraph"/>
+      </w:pPr>
+      <w:r>
+        <w:t xml:space="preserve">Aquí Homero no puede ser más sutil. Nos está mostrando el llanto de Ulises y lo compara con el de la esposa troyana que acaba de perder a su marido a manos del propio Ulises o de uno de sus compañeros aqueos. Y esta pobre viuda no solo llora la pérdida de su esposo, que ha muerto «por alejar de su pueblo y sus hijos la hora negrísima»; llora también por lo que le espera: «la llevan a esclavitud, a darle fatiga y desdichas». Nada de tomar partido, nada de moralina, nada de intentar encontrarle sentido a la tragedia: se limita a igualar las lágrimas del verdugo con las de la víctima. ¡Ay, qué hermoso sería que el cine moderno —y la mitad de la literatura— nos considerara igual de inteligentes que el Poeta!</w:t>
+      </w:r>
+    </w:p>
+    <w:p>
+      <w:pPr>
+        <w:pStyle w:val="BodyText"/>
       </w:pPr>
       <w:r>
         <w:t xml:space="preserve">Alcínoo se da cuenta de que su huésped lo está pasando mal y le pide al bardo que cese el canto:</w:t>

</xml_diff>